<commit_message>
doc: show all four card-enable lines (EN1=PC5 ... EN4=PA9) in order in the overview
Co-Authored-By: Claude Sonnet 5.5 <noreply@anthropic.com>
Claude-Session: https://claude.ai/code/session_0176yVfn6cAho71EZe1GaZ57
</commit_message>
<xml_diff>
--- a/Doc/HT_MK1_Overview.docx
+++ b/Doc/HT_MK1_Overview.docx
@@ -3108,6 +3108,75 @@
                 <w:szCs w:val="18"/>
               </w:rPr>
               <w:t xml:space="preserve">4 × 50-pin (J1 Matrix Card, J2–J4 HV Cards)</w:t>
+            </w:r>
+          </w:p>
+        </w:tc>
+      </w:tr>
+      <w:tr>
+        <w:trPr>
+          <w:cantSplit/>
+        </w:trPr>
+        <w:tc>
+          <w:tcPr>
+            <w:tcW w:type="dxa" w:w="2800"/>
+            <w:tcBorders>
+              <w:top w:val="single" w:color="BFC5CC" w:sz="4"/>
+              <w:left w:val="single" w:color="BFC5CC" w:sz="4"/>
+              <w:bottom w:val="single" w:color="BFC5CC" w:sz="4"/>
+              <w:right w:val="single" w:color="BFC5CC" w:sz="4"/>
+            </w:tcBorders>
+            <w:tcMar>
+              <w:top w:type="dxa" w:w="60"/>
+              <w:left w:type="dxa" w:w="100"/>
+              <w:bottom w:type="dxa" w:w="60"/>
+              <w:right w:type="dxa" w:w="100"/>
+            </w:tcMar>
+          </w:tcPr>
+          <w:p>
+            <w:pPr>
+              <w:spacing w:after="20"/>
+            </w:pPr>
+            <w:r>
+              <w:rPr>
+                <w:rFonts w:ascii="Arial" w:cs="Arial" w:eastAsia="Arial" w:hAnsi="Arial"/>
+                <w:b w:val="false"/>
+                <w:bCs w:val="false"/>
+                <w:sz w:val="18"/>
+                <w:szCs w:val="18"/>
+              </w:rPr>
+              <w:t xml:space="preserve">Card enables</w:t>
+            </w:r>
+          </w:p>
+        </w:tc>
+        <w:tc>
+          <w:tcPr>
+            <w:tcW w:type="dxa" w:w="7106"/>
+            <w:tcBorders>
+              <w:top w:val="single" w:color="BFC5CC" w:sz="4"/>
+              <w:left w:val="single" w:color="BFC5CC" w:sz="4"/>
+              <w:bottom w:val="single" w:color="BFC5CC" w:sz="4"/>
+              <w:right w:val="single" w:color="BFC5CC" w:sz="4"/>
+            </w:tcBorders>
+            <w:tcMar>
+              <w:top w:type="dxa" w:w="60"/>
+              <w:left w:type="dxa" w:w="100"/>
+              <w:bottom w:type="dxa" w:w="60"/>
+              <w:right w:type="dxa" w:w="100"/>
+            </w:tcMar>
+          </w:tcPr>
+          <w:p>
+            <w:pPr>
+              <w:spacing w:after="20"/>
+            </w:pPr>
+            <w:r>
+              <w:rPr>
+                <w:rFonts w:ascii="Arial" w:cs="Arial" w:eastAsia="Arial" w:hAnsi="Arial"/>
+                <w:b w:val="false"/>
+                <w:bCs w:val="false"/>
+                <w:sz w:val="18"/>
+                <w:szCs w:val="18"/>
+              </w:rPr>
+              <w:t xml:space="preserve">EN1 = PC5 (J1, Matrix Card) · EN2 = PC6 (J2) · EN3 = PA10 (J3) · EN4 = PA9 (J4). One is on at a time.</w:t>
             </w:r>
           </w:p>
         </w:tc>

</xml_diff>

<commit_message>
doc: HV cards 1-4 use EN1-EN4 (PC5, PC6, PA10, PA9); J1 is shared by Matrix Card and HV card 1
Co-Authored-By: Claude Sonnet 5.5 <noreply@anthropic.com>
Claude-Session: https://claude.ai/code/session_0176yVfn6cAho71EZe1GaZ57
</commit_message>
<xml_diff>
--- a/Doc/HT_MK1_Overview.docx
+++ b/Doc/HT_MK1_Overview.docx
@@ -3038,7 +3038,7 @@
                 <w:sz w:val="18"/>
                 <w:szCs w:val="18"/>
               </w:rPr>
-              <w:t xml:space="preserve">Hardware plan: 4 cards × 64 = 256 pins. Slots J2–J4 hold 3 cards (192 pins); a 4th needs the shared J1 slot</w:t>
+              <w:t xml:space="preserve">4 cards × 64 = 256 pins (slots J1 to J4)</w:t>
             </w:r>
           </w:p>
         </w:tc>
@@ -3107,7 +3107,7 @@
                 <w:sz w:val="18"/>
                 <w:szCs w:val="18"/>
               </w:rPr>
-              <w:t xml:space="preserve">4 × 50-pin (J1 Matrix Card, J2–J4 HV Cards)</w:t>
+              <w:t xml:space="preserve">4 × 50-pin: J1 is shared by the Matrix Card and HV Card 1; J2, J3, J4 hold HV Cards 2, 3, 4</w:t>
             </w:r>
           </w:p>
         </w:tc>
@@ -3176,7 +3176,7 @@
                 <w:sz w:val="18"/>
                 <w:szCs w:val="18"/>
               </w:rPr>
-              <w:t xml:space="preserve">EN1 = PC5 (J1, Matrix Card) · EN2 = PC6 (J2) · EN3 = PA10 (J3) · EN4 = PA9 (J4). One is on at a time.</w:t>
+              <w:t xml:space="preserve">EN1 = PC5 (HV Card 1) · EN2 = PC6 (HV Card 2) · EN3 = PA10 (HV Card 3) · EN4 = PA9 (HV Card 4). One is on at a time.</w:t>
             </w:r>
           </w:p>
         </w:tc>
@@ -3414,7 +3414,7 @@
           <w:sz w:val="20"/>
           <w:szCs w:val="20"/>
         </w:rPr>
-        <w:t xml:space="preserve">The firmware drives one card. A netlist with pins above 64 is refused. Reaching 256 pins needs more cards and the shared J1 slot.</w:t>
+        <w:t xml:space="preserve">The firmware is built for one card and refuses a netlist with pins above 64, although the hardware has four.</w:t>
       </w:r>
     </w:p>
     <w:p>

</xml_diff>

<commit_message>
doc: call the resistance method modified 4-wire
Co-Authored-By: Claude Sonnet 5.5 <noreply@anthropic.com>
Claude-Session: https://claude.ai/code/session_0176yVfn6cAho71EZe1GaZ57
</commit_message>
<xml_diff>
--- a/Doc/HT_MK1_Overview.docx
+++ b/Doc/HT_MK1_Overview.docx
@@ -527,7 +527,7 @@
                 <w:sz w:val="18"/>
                 <w:szCs w:val="18"/>
               </w:rPr>
-              <w:t xml:space="preserve">Measures the resistance of each wire (4-wire method).</w:t>
+              <w:t xml:space="preserve">Measures the resistance of each wire (modified 4-wire method).</w:t>
             </w:r>
           </w:p>
         </w:tc>
@@ -1771,7 +1771,7 @@
           <w:sz w:val="20"/>
           <w:szCs w:val="20"/>
         </w:rPr>
-        <w:t xml:space="preserve">Is it 2-wire or 4-wire? </w:t>
+        <w:t xml:space="preserve">Modified 4-wire. </w:t>
       </w:r>
       <w:r>
         <w:rPr>
@@ -3350,7 +3350,7 @@
           <w:sz w:val="20"/>
           <w:szCs w:val="20"/>
         </w:rPr>
-        <w:t xml:space="preserve">Resistance is 4-wire at the card pins. </w:t>
+        <w:t xml:space="preserve">Resistance is modified 4-wire (sensed at the card pins). </w:t>
       </w:r>
       <w:r>
         <w:rPr>

</xml_diff>

<commit_message>
doc: remove the limitations section from the overview
Co-Authored-By: Claude Sonnet 5.5 <noreply@anthropic.com>
Claude-Session: https://claude.ai/code/session_0176yVfn6cAho71EZe1GaZ57
</commit_message>
<xml_diff>
--- a/Doc/HT_MK1_Overview.docx
+++ b/Doc/HT_MK1_Overview.docx
@@ -3313,220 +3313,6 @@
           <w:szCs w:val="17"/>
         </w:rPr>
         <w:t xml:space="preserve">Figure 3. How 256 pins map to HV Cards (top) and to Matrix Card muxes (bottom).</w:t>
-      </w:r>
-    </w:p>
-    <w:p>
-      <w:pPr>
-        <w:pStyle w:val="Heading1"/>
-        <w:keepNext/>
-        <w:spacing w:after="120" w:before="280"/>
-      </w:pPr>
-      <w:r>
-        <w:rPr>
-          <w:rFonts w:ascii="Arial" w:cs="Arial" w:eastAsia="Arial" w:hAnsi="Arial"/>
-          <w:b/>
-          <w:bCs/>
-          <w:color w:val="1F3A5F"/>
-          <w:sz w:val="28"/>
-          <w:szCs w:val="28"/>
-        </w:rPr>
-        <w:t xml:space="preserve">7. Limitations</w:t>
-      </w:r>
-    </w:p>
-    <w:p>
-      <w:pPr>
-        <w:pStyle w:val="ListParagraph"/>
-        <w:numPr>
-          <w:ilvl w:val="0"/>
-          <w:numId w:val="2"/>
-        </w:numPr>
-        <w:spacing w:after="60" w:line="264"/>
-      </w:pPr>
-      <w:r>
-        <w:rPr>
-          <w:rFonts w:ascii="Arial" w:cs="Arial" w:eastAsia="Arial" w:hAnsi="Arial"/>
-          <w:b/>
-          <w:bCs/>
-          <w:sz w:val="20"/>
-          <w:szCs w:val="20"/>
-        </w:rPr>
-        <w:t xml:space="preserve">Resistance is modified 4-wire (sensed at the card pins). </w:t>
-      </w:r>
-      <w:r>
-        <w:rPr>
-          <w:rFonts w:ascii="Arial" w:cs="Arial" w:eastAsia="Arial" w:hAnsi="Arial"/>
-          <w:sz w:val="20"/>
-          <w:szCs w:val="20"/>
-        </w:rPr>
-        <w:t xml:space="preserve">Cable and fixture contact resistance is part of the reading.</w:t>
-      </w:r>
-    </w:p>
-    <w:p>
-      <w:pPr>
-        <w:pStyle w:val="ListParagraph"/>
-        <w:numPr>
-          <w:ilvl w:val="0"/>
-          <w:numId w:val="2"/>
-        </w:numPr>
-        <w:spacing w:after="60" w:line="264"/>
-      </w:pPr>
-      <w:r>
-        <w:rPr>
-          <w:rFonts w:ascii="Arial" w:cs="Arial" w:eastAsia="Arial" w:hAnsi="Arial"/>
-          <w:b/>
-          <w:bCs/>
-          <w:sz w:val="20"/>
-          <w:szCs w:val="20"/>
-        </w:rPr>
-        <w:t xml:space="preserve">Fixed 2 mA. </w:t>
-      </w:r>
-      <w:r>
-        <w:rPr>
-          <w:rFonts w:ascii="Arial" w:cs="Arial" w:eastAsia="Arial" w:hAnsi="Arial"/>
-          <w:sz w:val="20"/>
-          <w:szCs w:val="20"/>
-        </w:rPr>
-        <w:t xml:space="preserve">This is the maximum of the current source. It suits wire-level resistance; the default limit is 5 Ω.</w:t>
-      </w:r>
-    </w:p>
-    <w:p>
-      <w:pPr>
-        <w:pStyle w:val="ListParagraph"/>
-        <w:numPr>
-          <w:ilvl w:val="0"/>
-          <w:numId w:val="2"/>
-        </w:numPr>
-        <w:spacing w:after="60" w:line="264"/>
-      </w:pPr>
-      <w:r>
-        <w:rPr>
-          <w:rFonts w:ascii="Arial" w:cs="Arial" w:eastAsia="Arial" w:hAnsi="Arial"/>
-          <w:b/>
-          <w:bCs/>
-          <w:sz w:val="20"/>
-          <w:szCs w:val="20"/>
-        </w:rPr>
-        <w:t xml:space="preserve">Insulation covers one HV Card today (64 pins). </w:t>
-      </w:r>
-      <w:r>
-        <w:rPr>
-          <w:rFonts w:ascii="Arial" w:cs="Arial" w:eastAsia="Arial" w:hAnsi="Arial"/>
-          <w:sz w:val="20"/>
-          <w:szCs w:val="20"/>
-        </w:rPr>
-        <w:t xml:space="preserve">The firmware is built for one card and refuses a netlist with pins above 64, although the hardware has four.</w:t>
-      </w:r>
-    </w:p>
-    <w:p>
-      <w:pPr>
-        <w:pStyle w:val="ListParagraph"/>
-        <w:numPr>
-          <w:ilvl w:val="0"/>
-          <w:numId w:val="2"/>
-        </w:numPr>
-        <w:spacing w:after="60" w:line="264"/>
-      </w:pPr>
-      <w:r>
-        <w:rPr>
-          <w:rFonts w:ascii="Arial" w:cs="Arial" w:eastAsia="Arial" w:hAnsi="Arial"/>
-          <w:b/>
-          <w:bCs/>
-          <w:sz w:val="20"/>
-          <w:szCs w:val="20"/>
-        </w:rPr>
-        <w:t xml:space="preserve">Insulation leakage is measured on the same card only. </w:t>
-      </w:r>
-      <w:r>
-        <w:rPr>
-          <w:rFonts w:ascii="Arial" w:cs="Arial" w:eastAsia="Arial" w:hAnsi="Arial"/>
-          <w:sz w:val="20"/>
-          <w:szCs w:val="20"/>
-        </w:rPr>
-        <w:t xml:space="preserve">Leakage into conductors on another HV Card is not measured.</w:t>
-      </w:r>
-    </w:p>
-    <w:p>
-      <w:pPr>
-        <w:pStyle w:val="ListParagraph"/>
-        <w:numPr>
-          <w:ilvl w:val="0"/>
-          <w:numId w:val="2"/>
-        </w:numPr>
-        <w:spacing w:after="60" w:line="264"/>
-      </w:pPr>
-      <w:r>
-        <w:rPr>
-          <w:rFonts w:ascii="Arial" w:cs="Arial" w:eastAsia="Arial" w:hAnsi="Arial"/>
-          <w:b/>
-          <w:bCs/>
-          <w:sz w:val="20"/>
-          <w:szCs w:val="20"/>
-        </w:rPr>
-        <w:t xml:space="preserve">Insulation value display tops out at 2.147 MΩ. </w:t>
-      </w:r>
-      <w:r>
-        <w:rPr>
-          <w:rFonts w:ascii="Arial" w:cs="Arial" w:eastAsia="Arial" w:hAnsi="Arial"/>
-          <w:sz w:val="20"/>
-          <w:szCs w:val="20"/>
-        </w:rPr>
-        <w:t xml:space="preserve">The pass or fail result is still correct.</w:t>
-      </w:r>
-    </w:p>
-    <w:p>
-      <w:pPr>
-        <w:pStyle w:val="ListParagraph"/>
-        <w:numPr>
-          <w:ilvl w:val="0"/>
-          <w:numId w:val="2"/>
-        </w:numPr>
-        <w:spacing w:after="60" w:line="264"/>
-      </w:pPr>
-      <w:r>
-        <w:rPr>
-          <w:rFonts w:ascii="Arial" w:cs="Arial" w:eastAsia="Arial" w:hAnsi="Arial"/>
-          <w:b/>
-          <w:bCs/>
-          <w:sz w:val="20"/>
-          <w:szCs w:val="20"/>
-        </w:rPr>
-        <w:t xml:space="preserve">Insulation test voltage is fixed at 500 V.</w:t>
-      </w:r>
-      <w:r>
-        <w:rPr>
-          <w:rFonts w:ascii="Arial" w:cs="Arial" w:eastAsia="Arial" w:hAnsi="Arial"/>
-          <w:sz w:val="20"/>
-          <w:szCs w:val="20"/>
-        </w:rPr>
-        <w:t xml:space="preserve"/>
-      </w:r>
-    </w:p>
-    <w:p>
-      <w:pPr>
-        <w:pStyle w:val="ListParagraph"/>
-        <w:numPr>
-          <w:ilvl w:val="0"/>
-          <w:numId w:val="2"/>
-        </w:numPr>
-        <w:spacing w:after="60" w:line="264"/>
-      </w:pPr>
-      <w:r>
-        <w:rPr>
-          <w:rFonts w:ascii="Arial" w:cs="Arial" w:eastAsia="Arial" w:hAnsi="Arial"/>
-          <w:b/>
-          <w:bCs/>
-          <w:sz w:val="20"/>
-          <w:szCs w:val="20"/>
-        </w:rPr>
-        <w:t xml:space="preserve">Continuity thresholds </w:t>
-      </w:r>
-      <w:r>
-        <w:rPr>
-          <w:rFonts w:ascii="Arial" w:cs="Arial" w:eastAsia="Arial" w:hAnsi="Arial"/>
-          <w:sz w:val="20"/>
-          <w:szCs w:val="20"/>
-        </w:rPr>
-        <w:t xml:space="preserve">need tuning on the first real harness.</w:t>
       </w:r>
     </w:p>
     <w:sectPr>

</xml_diff>